<commit_message>
certyfikat.r.docx: usunięte komentarze z szablonu
Co-Authored-By: Claude Opus 5.5 <noreply@anthropic.com>
</commit_message>
<xml_diff>
--- a/backend/documents/templates/certyfikat.r.docx
+++ b/backend/documents/templates/certyfikat.r.docx
@@ -1,6 +1,6 @@
 
 <file path=word/document.xml><?xml version="1.0" encoding="utf-8"?>
-<w:document xmlns:wpc="http://schemas.microsoft.com/office/word/2010/wordprocessingCanvas" xmlns:cx="http://schemas.microsoft.com/office/drawing/2014/chartex" xmlns:cx1="http://schemas.microsoft.com/office/drawing/2015/9/8/chartex" xmlns:cx2="http://schemas.microsoft.com/office/drawing/2015/10/21/chartex" xmlns:cx3="http://schemas.microsoft.com/office/drawing/2016/5/9/chartex" xmlns:cx4="http://schemas.microsoft.com/office/drawing/2016/5/10/chartex" xmlns:cx5="http://schemas.microsoft.com/office/drawing/2016/5/11/chartex" xmlns:cx6="http://schemas.microsoft.com/office/drawing/2016/5/12/chartex" xmlns:cx7="http://schemas.microsoft.com/office/drawing/2016/5/13/chartex" xmlns:cx8="http://schemas.microsoft.com/office/drawing/2016/5/14/chartex" xmlns:mc="http://schemas.openxmlformats.org/markup-compatibility/2006" xmlns:aink="http://schemas.microsoft.com/office/drawing/2016/ink" xmlns:am3d="http://schemas.microsoft.com/office/drawing/2017/model3d" xmlns:o="urn:schemas-microsoft-com:office:office" xmlns:oel="http://schemas.microsoft.com/office/2019/extlst" xmlns:r="http://schemas.openxmlformats.org/officeDocument/2006/relationships" xmlns:m="http://schemas.openxmlformats.org/officeDocument/2006/math" xmlns:v="urn:schemas-microsoft-com:vml" xmlns:wp14="http://schemas.microsoft.com/office/word/2010/wordprocessingDrawing" xmlns:wp="http://schemas.openxmlformats.org/drawingml/2006/wordprocessingDrawing" xmlns:w10="urn:schemas-microsoft-com:office:word" xmlns:w="http://schemas.openxmlformats.org/wordprocessingml/2006/main" xmlns:w14="http://schemas.microsoft.com/office/word/2010/wordml" xmlns:w15="http://schemas.microsoft.com/office/word/2012/wordml" xmlns:w16cex="http://schemas.microsoft.com/office/word/2018/wordml/cex" xmlns:w16cid="http://schemas.microsoft.com/office/word/2016/wordml/cid" xmlns:w16="http://schemas.microsoft.com/office/word/2018/wordml" xmlns:w16du="http://schemas.microsoft.com/office/word/2023/wordml/word16du" xmlns:w16sdtdh="http://schemas.microsoft.com/office/word/2020/wordml/sdtdatahash" xmlns:w16sdtfl="http://schemas.microsoft.com/office/word/2024/wordml/sdtformatlock" xmlns:w16se="http://schemas.microsoft.com/office/word/2015/wordml/symex" xmlns:wpg="http://schemas.microsoft.com/office/word/2010/wordprocessingGroup" xmlns:wpi="http://schemas.microsoft.com/office/word/2010/wordprocessingInk" xmlns:wne="http://schemas.microsoft.com/office/word/2006/wordml" xmlns:wps="http://schemas.microsoft.com/office/word/2010/wordprocessingShape" mc:Ignorable="w14 w15 w16se w16cid w16 w16cex w16sdtdh w16sdtfl w16du wp14">
+<w:document xmlns:wpc="http://schemas.microsoft.com/office/word/2010/wordprocessingCanvas" xmlns:cx="http://schemas.microsoft.com/office/drawing/2014/chartex" xmlns:cx1="http://schemas.microsoft.com/office/drawing/2015/9/8/chartex" xmlns:cx2="http://schemas.microsoft.com/office/drawing/2015/10/21/chartex" xmlns:cx3="http://schemas.microsoft.com/office/drawing/2016/5/9/chartex" xmlns:cx4="http://schemas.microsoft.com/office/drawing/2016/5/10/chartex" xmlns:cx5="http://schemas.microsoft.com/office/drawing/2016/5/11/chartex" xmlns:cx6="http://schemas.microsoft.com/office/drawing/2016/5/12/chartex" xmlns:cx7="http://schemas.microsoft.com/office/drawing/2016/5/13/chartex" xmlns:cx8="http://schemas.microsoft.com/office/drawing/2016/5/14/chartex" xmlns:mc="http://schemas.openxmlformats.org/markup-compatibility/2006" xmlns:m="http://schemas.openxmlformats.org/officeDocument/2006/math" xmlns:aink="http://schemas.microsoft.com/office/drawing/2016/ink" xmlns:am3d="http://schemas.microsoft.com/office/drawing/2017/model3d" xmlns:oel="http://schemas.microsoft.com/office/2019/extlst" xmlns:r="http://schemas.openxmlformats.org/officeDocument/2006/relationships" xmlns:wp14="http://schemas.microsoft.com/office/word/2010/wordprocessingDrawing" xmlns:wp="http://schemas.openxmlformats.org/drawingml/2006/wordprocessingDrawing" xmlns:wpg="http://schemas.microsoft.com/office/word/2010/wordprocessingGroup" xmlns:wpi="http://schemas.microsoft.com/office/word/2010/wordprocessingInk" xmlns:wps="http://schemas.microsoft.com/office/word/2010/wordprocessingShape" xmlns:o="urn:schemas-microsoft-com:office:office" xmlns:v="urn:schemas-microsoft-com:vml" xmlns:w10="urn:schemas-microsoft-com:office:word" xmlns:w="http://schemas.openxmlformats.org/wordprocessingml/2006/main" xmlns:w14="http://schemas.microsoft.com/office/word/2010/wordml" xmlns:w15="http://schemas.microsoft.com/office/word/2012/wordml" xmlns:w16cex="http://schemas.microsoft.com/office/word/2018/wordml/cex" xmlns:w16cid="http://schemas.microsoft.com/office/word/2016/wordml/cid" xmlns:w16="http://schemas.microsoft.com/office/word/2018/wordml" xmlns:w16sdtdh="http://schemas.microsoft.com/office/word/2020/wordml/sdtdatahash" xmlns:w16sdtfl="http://schemas.microsoft.com/office/word/2024/wordml/sdtformatlock" xmlns:w16se="http://schemas.microsoft.com/office/word/2015/wordml/symex" xmlns:w16du="http://schemas.microsoft.com/office/word/2023/wordml/word16du" xmlns:wne="http://schemas.microsoft.com/office/word/2006/wordml" mc:Ignorable="w14 w15 w16se w16cid w16 w16cex w16sdtdh w16sdtfl w16du wp14">
   <w:body>
     <w:p>
       <w:pPr>
@@ -70,12 +70,37 @@
                             <w:pPr>
                               <w:jc w:val="center"/>
                             </w:pPr>
+                            <w:proofErr w:type="spellStart"/>
                             <w:r>
                               <w:rPr>
                                 <w:b/>
                                 <w:bCs/>
                               </w:rPr>
-                              <w:t>Mc Med Maciej Świerszcz</w:t>
+                              <w:t>Mc</w:t>
+                            </w:r>
+                            <w:proofErr w:type="spellEnd"/>
+                            <w:r>
+                              <w:rPr>
+                                <w:b/>
+                                <w:bCs/>
+                              </w:rPr>
+                              <w:t xml:space="preserve"> </w:t>
+                            </w:r>
+                            <w:proofErr w:type="spellStart"/>
+                            <w:r>
+                              <w:rPr>
+                                <w:b/>
+                                <w:bCs/>
+                              </w:rPr>
+                              <w:t>Med</w:t>
+                            </w:r>
+                            <w:proofErr w:type="spellEnd"/>
+                            <w:r>
+                              <w:rPr>
+                                <w:b/>
+                                <w:bCs/>
+                              </w:rPr>
+                              <w:t xml:space="preserve"> Maciej Świerszcz</w:t>
                             </w:r>
                             <w:r>
                               <w:t xml:space="preserve"> </w:t>
@@ -146,7 +171,23 @@
                                 <w:szCs w:val="18"/>
                               </w:rPr>
                               <w:br/>
-                              <w:t>tel. 785725603 e-m@il: mcmed@wp.pl</w:t>
+                              <w:t xml:space="preserve">tel. 785725603 </w:t>
+                            </w:r>
+                            <w:proofErr w:type="spellStart"/>
+                            <w:r>
+                              <w:rPr>
+                                <w:sz w:val="18"/>
+                                <w:szCs w:val="18"/>
+                              </w:rPr>
+                              <w:t>e-m@il</w:t>
+                            </w:r>
+                            <w:proofErr w:type="spellEnd"/>
+                            <w:r>
+                              <w:rPr>
+                                <w:sz w:val="18"/>
+                                <w:szCs w:val="18"/>
+                              </w:rPr>
+                              <w:t>: mcmed@wp.pl</w:t>
                             </w:r>
                           </w:p>
                         </w:txbxContent>
@@ -278,7 +319,21 @@
         <w:rPr>
           <w:rFonts w:ascii="Times New Roman" w:hAnsi="Times New Roman" w:cs="Times New Roman"/>
         </w:rPr>
-        <w:t>…………………………………..</w:t>
+        <w:t>……………………………</w:t>
+      </w:r>
+      <w:proofErr w:type="gramStart"/>
+      <w:r>
+        <w:rPr>
+          <w:rFonts w:ascii="Times New Roman" w:hAnsi="Times New Roman" w:cs="Times New Roman"/>
+        </w:rPr>
+        <w:t>…….</w:t>
+      </w:r>
+      <w:proofErr w:type="gramEnd"/>
+      <w:r>
+        <w:rPr>
+          <w:rFonts w:ascii="Times New Roman" w:hAnsi="Times New Roman" w:cs="Times New Roman"/>
+        </w:rPr>
+        <w:t>.</w:t>
       </w:r>
       <w:r>
         <w:rPr>
@@ -370,7 +425,30 @@
           <w:sz w:val="26"/>
           <w:szCs w:val="26"/>
         </w:rPr>
-        <w:t>{{c_n}}</w:t>
+        <w:t>{{</w:t>
+      </w:r>
+      <w:proofErr w:type="spellStart"/>
+      <w:r>
+        <w:rPr>
+          <w:rFonts w:ascii="Times New Roman" w:hAnsi="Times New Roman" w:cs="Times New Roman"/>
+          <w:b/>
+          <w:bCs/>
+          <w:sz w:val="26"/>
+          <w:szCs w:val="26"/>
+        </w:rPr>
+        <w:t>c_n</w:t>
+      </w:r>
+      <w:proofErr w:type="spellEnd"/>
+      <w:proofErr w:type="gramStart"/>
+      <w:r>
+        <w:rPr>
+          <w:rFonts w:ascii="Times New Roman" w:hAnsi="Times New Roman" w:cs="Times New Roman"/>
+          <w:b/>
+          <w:bCs/>
+          <w:sz w:val="26"/>
+          <w:szCs w:val="26"/>
+        </w:rPr>
+        <w:t>}}</w:t>
       </w:r>
       <w:r>
         <w:rPr>
@@ -382,15 +460,27 @@
         </w:rPr>
         <w:t>/</w:t>
       </w:r>
-      <w:r>
-        <w:rPr>
-          <w:rFonts w:ascii="Times New Roman" w:hAnsi="Times New Roman" w:cs="Times New Roman"/>
-          <w:b/>
-          <w:bCs/>
-          <w:sz w:val="26"/>
-          <w:szCs w:val="26"/>
-        </w:rPr>
-        <w:t>{{y}}</w:t>
+      <w:proofErr w:type="gramEnd"/>
+      <w:r>
+        <w:rPr>
+          <w:rFonts w:ascii="Times New Roman" w:hAnsi="Times New Roman" w:cs="Times New Roman"/>
+          <w:b/>
+          <w:bCs/>
+          <w:sz w:val="26"/>
+          <w:szCs w:val="26"/>
+        </w:rPr>
+        <w:t>{{y</w:t>
+      </w:r>
+      <w:proofErr w:type="gramStart"/>
+      <w:r>
+        <w:rPr>
+          <w:rFonts w:ascii="Times New Roman" w:hAnsi="Times New Roman" w:cs="Times New Roman"/>
+          <w:b/>
+          <w:bCs/>
+          <w:sz w:val="26"/>
+          <w:szCs w:val="26"/>
+        </w:rPr>
+        <w:t>}}</w:t>
       </w:r>
       <w:r>
         <w:rPr>
@@ -402,15 +492,38 @@
         </w:rPr>
         <w:t>/</w:t>
       </w:r>
-      <w:r>
-        <w:rPr>
-          <w:rFonts w:ascii="Times New Roman" w:hAnsi="Times New Roman" w:cs="Times New Roman"/>
-          <w:b/>
-          <w:bCs/>
-          <w:sz w:val="26"/>
-          <w:szCs w:val="26"/>
-        </w:rPr>
-        <w:t>{{lp}}</w:t>
+      <w:proofErr w:type="gramEnd"/>
+      <w:r>
+        <w:rPr>
+          <w:rFonts w:ascii="Times New Roman" w:hAnsi="Times New Roman" w:cs="Times New Roman"/>
+          <w:b/>
+          <w:bCs/>
+          <w:sz w:val="26"/>
+          <w:szCs w:val="26"/>
+        </w:rPr>
+        <w:t>{{</w:t>
+      </w:r>
+      <w:proofErr w:type="spellStart"/>
+      <w:r>
+        <w:rPr>
+          <w:rFonts w:ascii="Times New Roman" w:hAnsi="Times New Roman" w:cs="Times New Roman"/>
+          <w:b/>
+          <w:bCs/>
+          <w:sz w:val="26"/>
+          <w:szCs w:val="26"/>
+        </w:rPr>
+        <w:t>lp</w:t>
+      </w:r>
+      <w:proofErr w:type="spellEnd"/>
+      <w:r>
+        <w:rPr>
+          <w:rFonts w:ascii="Times New Roman" w:hAnsi="Times New Roman" w:cs="Times New Roman"/>
+          <w:b/>
+          <w:bCs/>
+          <w:sz w:val="26"/>
+          <w:szCs w:val="26"/>
+        </w:rPr>
+        <w:t>}}</w:t>
       </w:r>
       <w:r>
         <w:rPr>
@@ -434,7 +547,87 @@
           <w:sz w:val="26"/>
           <w:szCs w:val="26"/>
         </w:rPr>
-        <w:t xml:space="preserve">                      </w:t>
+        <w:t xml:space="preserve">                   </w:t>
+      </w:r>
+      <w:proofErr w:type="gramStart"/>
+      <w:r>
+        <w:rPr>
+          <w:rFonts w:ascii="Times New Roman" w:hAnsi="Times New Roman" w:cs="Times New Roman"/>
+          <w:sz w:val="26"/>
+          <w:szCs w:val="26"/>
+        </w:rPr>
+        <w:t xml:space="preserve">   </w:t>
+      </w:r>
+      <w:r>
+        <w:rPr>
+          <w:rFonts w:ascii="Times New Roman" w:hAnsi="Times New Roman" w:cs="Times New Roman"/>
+          <w:b/>
+          <w:bCs/>
+          <w:sz w:val="26"/>
+          <w:szCs w:val="26"/>
+        </w:rPr>
+        <w:t>{</w:t>
+      </w:r>
+      <w:proofErr w:type="gramEnd"/>
+      <w:r>
+        <w:rPr>
+          <w:rFonts w:ascii="Times New Roman" w:hAnsi="Times New Roman" w:cs="Times New Roman"/>
+          <w:b/>
+          <w:bCs/>
+          <w:sz w:val="26"/>
+          <w:szCs w:val="26"/>
+        </w:rPr>
+        <w:t>{</w:t>
+      </w:r>
+      <w:proofErr w:type="spellStart"/>
+      <w:r>
+        <w:rPr>
+          <w:rFonts w:ascii="Times New Roman" w:hAnsi="Times New Roman" w:cs="Times New Roman"/>
+          <w:b/>
+          <w:bCs/>
+          <w:sz w:val="26"/>
+          <w:szCs w:val="26"/>
+        </w:rPr>
+        <w:t>exam</w:t>
+      </w:r>
+      <w:r>
+        <w:rPr>
+          <w:rFonts w:ascii="Times New Roman" w:hAnsi="Times New Roman" w:cs="Times New Roman"/>
+          <w:b/>
+          <w:bCs/>
+          <w:sz w:val="26"/>
+          <w:szCs w:val="26"/>
+        </w:rPr>
+        <w:t>_</w:t>
+      </w:r>
+      <w:r>
+        <w:rPr>
+          <w:rFonts w:ascii="Times New Roman" w:hAnsi="Times New Roman" w:cs="Times New Roman"/>
+          <w:b/>
+          <w:bCs/>
+          <w:sz w:val="26"/>
+          <w:szCs w:val="26"/>
+        </w:rPr>
+        <w:t>c</w:t>
+      </w:r>
+      <w:proofErr w:type="spellEnd"/>
+      <w:r>
+        <w:rPr>
+          <w:rFonts w:ascii="Times New Roman" w:hAnsi="Times New Roman" w:cs="Times New Roman"/>
+          <w:b/>
+          <w:bCs/>
+          <w:sz w:val="26"/>
+          <w:szCs w:val="26"/>
+        </w:rPr>
+        <w:t>}}</w:t>
+      </w:r>
+      <w:r>
+        <w:rPr>
+          <w:rFonts w:ascii="Times New Roman" w:hAnsi="Times New Roman" w:cs="Times New Roman"/>
+          <w:sz w:val="26"/>
+          <w:szCs w:val="26"/>
+        </w:rPr>
+        <w:t xml:space="preserve">, dn. </w:t>
       </w:r>
       <w:r>
         <w:rPr>
@@ -446,36 +639,18 @@
         </w:rPr>
         <w:t>{{</w:t>
       </w:r>
-      <w:r>
-        <w:rPr>
-          <w:rFonts w:ascii="Times New Roman" w:hAnsi="Times New Roman" w:cs="Times New Roman"/>
-          <w:b/>
-          <w:bCs/>
-          <w:sz w:val="26"/>
-          <w:szCs w:val="26"/>
-        </w:rPr>
-        <w:t>exam</w:t>
-      </w:r>
-      <w:r>
-        <w:rPr>
-          <w:rFonts w:ascii="Times New Roman" w:hAnsi="Times New Roman" w:cs="Times New Roman"/>
-          <w:b/>
-          <w:bCs/>
-          <w:sz w:val="26"/>
-          <w:szCs w:val="26"/>
-        </w:rPr>
-        <w:t>_</w:t>
-      </w:r>
-      <w:r>
-        <w:rPr>
-          <w:rFonts w:ascii="Times New Roman" w:hAnsi="Times New Roman" w:cs="Times New Roman"/>
-          <w:b/>
-          <w:bCs/>
-          <w:sz w:val="26"/>
-          <w:szCs w:val="26"/>
-        </w:rPr>
-        <w:t>c</w:t>
-      </w:r>
+      <w:proofErr w:type="spellStart"/>
+      <w:r>
+        <w:rPr>
+          <w:rFonts w:ascii="Times New Roman" w:hAnsi="Times New Roman" w:cs="Times New Roman"/>
+          <w:b/>
+          <w:bCs/>
+          <w:sz w:val="26"/>
+          <w:szCs w:val="26"/>
+        </w:rPr>
+        <w:t>exam_date</w:t>
+      </w:r>
+      <w:proofErr w:type="spellEnd"/>
       <w:r>
         <w:rPr>
           <w:rFonts w:ascii="Times New Roman" w:hAnsi="Times New Roman" w:cs="Times New Roman"/>
@@ -485,24 +660,6 @@
           <w:szCs w:val="26"/>
         </w:rPr>
         <w:t>}}</w:t>
-      </w:r>
-      <w:r>
-        <w:rPr>
-          <w:rFonts w:ascii="Times New Roman" w:hAnsi="Times New Roman" w:cs="Times New Roman"/>
-          <w:sz w:val="26"/>
-          <w:szCs w:val="26"/>
-        </w:rPr>
-        <w:t xml:space="preserve">, dn. </w:t>
-      </w:r>
-      <w:r>
-        <w:rPr>
-          <w:rFonts w:ascii="Times New Roman" w:hAnsi="Times New Roman" w:cs="Times New Roman"/>
-          <w:b/>
-          <w:bCs/>
-          <w:sz w:val="26"/>
-          <w:szCs w:val="26"/>
-        </w:rPr>
-        <w:t>{{exam_date}}</w:t>
       </w:r>
       <w:r>
         <w:rPr>
@@ -802,7 +959,29 @@
           <w:sz w:val="36"/>
           <w:szCs w:val="36"/>
         </w:rPr>
-        <w:t>{{p_pesel}}</w:t>
+        <w:t>{{</w:t>
+      </w:r>
+      <w:proofErr w:type="spellStart"/>
+      <w:r>
+        <w:rPr>
+          <w:rFonts w:ascii="Times New Roman" w:hAnsi="Times New Roman" w:cs="Times New Roman"/>
+          <w:b/>
+          <w:bCs/>
+          <w:sz w:val="36"/>
+          <w:szCs w:val="36"/>
+        </w:rPr>
+        <w:t>p_pesel</w:t>
+      </w:r>
+      <w:proofErr w:type="spellEnd"/>
+      <w:r>
+        <w:rPr>
+          <w:rFonts w:ascii="Times New Roman" w:hAnsi="Times New Roman" w:cs="Times New Roman"/>
+          <w:b/>
+          <w:bCs/>
+          <w:sz w:val="36"/>
+          <w:szCs w:val="36"/>
+        </w:rPr>
+        <w:t>}}</w:t>
       </w:r>
       <w:r>
         <w:rPr>
@@ -914,7 +1093,29 @@
           <w:sz w:val="28"/>
           <w:szCs w:val="28"/>
         </w:rPr>
-        <w:t>{{exam_date}}</w:t>
+        <w:t>{{</w:t>
+      </w:r>
+      <w:proofErr w:type="spellStart"/>
+      <w:r>
+        <w:rPr>
+          <w:rFonts w:ascii="Times New Roman" w:hAnsi="Times New Roman" w:cs="Times New Roman"/>
+          <w:b/>
+          <w:bCs/>
+          <w:sz w:val="28"/>
+          <w:szCs w:val="28"/>
+        </w:rPr>
+        <w:t>exam_date</w:t>
+      </w:r>
+      <w:proofErr w:type="spellEnd"/>
+      <w:r>
+        <w:rPr>
+          <w:rFonts w:ascii="Times New Roman" w:hAnsi="Times New Roman" w:cs="Times New Roman"/>
+          <w:b/>
+          <w:bCs/>
+          <w:sz w:val="28"/>
+          <w:szCs w:val="28"/>
+        </w:rPr>
+        <w:t>}}</w:t>
       </w:r>
       <w:r>
         <w:rPr>
@@ -1202,24 +1403,31 @@
           <w:szCs w:val="12"/>
         </w:rPr>
       </w:pPr>
-      <w:commentRangeStart w:id="0"/>
       <w:r>
         <w:rPr>
           <w:rFonts w:ascii="Times New Roman" w:hAnsi="Times New Roman" w:cs="Times New Roman"/>
           <w:sz w:val="12"/>
           <w:szCs w:val="12"/>
         </w:rPr>
-        <w:t xml:space="preserve">MACIEJ śwIERSZCZ </w:t>
-      </w:r>
-      <w:commentRangeEnd w:id="0"/>
-      <w:r>
-        <w:rPr>
-          <w:rStyle w:val="Odwoaniedokomentarza"/>
+        <w:t xml:space="preserve">MACIEJ </w:t>
+      </w:r>
+      <w:proofErr w:type="spellStart"/>
+      <w:r>
+        <w:rPr>
           <w:rFonts w:ascii="Times New Roman" w:hAnsi="Times New Roman" w:cs="Times New Roman"/>
           <w:sz w:val="12"/>
           <w:szCs w:val="12"/>
         </w:rPr>
-        <w:commentReference w:id="0"/>
+        <w:t>śwIERSZCZ</w:t>
+      </w:r>
+      <w:proofErr w:type="spellEnd"/>
+      <w:r>
+        <w:rPr>
+          <w:rFonts w:ascii="Times New Roman" w:hAnsi="Times New Roman" w:cs="Times New Roman"/>
+          <w:sz w:val="12"/>
+          <w:szCs w:val="12"/>
+        </w:rPr>
+        <w:t xml:space="preserve"> </w:t>
       </w:r>
     </w:p>
     <w:p>
@@ -1277,7 +1485,6 @@
         </w:rPr>
         <w:tab/>
       </w:r>
-      <w:commentRangeStart w:id="1"/>
       <w:r>
         <w:rPr>
           <w:rFonts w:ascii="Times New Roman" w:hAnsi="Times New Roman" w:cs="Times New Roman"/>
@@ -1287,18 +1494,6 @@
           <w:szCs w:val="12"/>
         </w:rPr>
         <w:t xml:space="preserve">                                                                                                       </w:t>
-      </w:r>
-      <w:commentRangeEnd w:id="1"/>
-      <w:r>
-        <w:rPr>
-          <w:rStyle w:val="Odwoaniedokomentarza"/>
-          <w:rFonts w:ascii="Times New Roman" w:hAnsi="Times New Roman" w:cs="Times New Roman"/>
-          <w:b/>
-          <w:bCs/>
-          <w:sz w:val="24"/>
-          <w:szCs w:val="24"/>
-        </w:rPr>
-        <w:commentReference w:id="1"/>
       </w:r>
       <w:r>
         <w:rPr>
@@ -1363,23 +1558,51 @@
           <w:sz w:val="16"/>
           <w:szCs w:val="16"/>
         </w:rPr>
-        <w:t>(podpis, imię i nazwisko kierownika podmiotu                                                                             (podpisy członków komisji</w:t>
-      </w:r>
+        <w:t xml:space="preserve">(podpis, imię i nazwisko kierownika podmiotu                                                                          </w:t>
+      </w:r>
+      <w:proofErr w:type="gramStart"/>
       <w:r>
         <w:rPr>
           <w:rFonts w:ascii="Times New Roman" w:hAnsi="Times New Roman" w:cs="Times New Roman"/>
           <w:sz w:val="16"/>
           <w:szCs w:val="16"/>
         </w:rPr>
-        <w:t xml:space="preserve"> </w:t>
-      </w:r>
+        <w:t xml:space="preserve">   (</w:t>
+      </w:r>
+      <w:proofErr w:type="gramEnd"/>
       <w:r>
         <w:rPr>
           <w:rFonts w:ascii="Times New Roman" w:hAnsi="Times New Roman" w:cs="Times New Roman"/>
           <w:sz w:val="16"/>
           <w:szCs w:val="16"/>
         </w:rPr>
-        <w:t xml:space="preserve">egzaminacyjnej)  przeprowadzającego egzamin)                                                                                </w:t>
+        <w:t>podpisy członków komisji</w:t>
+      </w:r>
+      <w:r>
+        <w:rPr>
+          <w:rFonts w:ascii="Times New Roman" w:hAnsi="Times New Roman" w:cs="Times New Roman"/>
+          <w:sz w:val="16"/>
+          <w:szCs w:val="16"/>
+        </w:rPr>
+        <w:t xml:space="preserve"> </w:t>
+      </w:r>
+      <w:proofErr w:type="gramStart"/>
+      <w:r>
+        <w:rPr>
+          <w:rFonts w:ascii="Times New Roman" w:hAnsi="Times New Roman" w:cs="Times New Roman"/>
+          <w:sz w:val="16"/>
+          <w:szCs w:val="16"/>
+        </w:rPr>
+        <w:t>egzaminacyjnej)  przeprowadzającego</w:t>
+      </w:r>
+      <w:proofErr w:type="gramEnd"/>
+      <w:r>
+        <w:rPr>
+          <w:rFonts w:ascii="Times New Roman" w:hAnsi="Times New Roman" w:cs="Times New Roman"/>
+          <w:sz w:val="16"/>
+          <w:szCs w:val="16"/>
+        </w:rPr>
+        <w:t xml:space="preserve"> egzamin)                                                                                </w:t>
       </w:r>
       <w:r>
         <w:rPr>
@@ -1400,74 +1623,8 @@
 </w:document>
 </file>
 
-<file path=word/comments.xml><?xml version="1.0" encoding="utf-8"?>
-<w:comments xmlns:wpc="http://schemas.microsoft.com/office/word/2010/wordprocessingCanvas" xmlns:cx="http://schemas.microsoft.com/office/drawing/2014/chartex" xmlns:cx1="http://schemas.microsoft.com/office/drawing/2015/9/8/chartex" xmlns:cx2="http://schemas.microsoft.com/office/drawing/2015/10/21/chartex" xmlns:cx3="http://schemas.microsoft.com/office/drawing/2016/5/9/chartex" xmlns:cx4="http://schemas.microsoft.com/office/drawing/2016/5/10/chartex" xmlns:cx5="http://schemas.microsoft.com/office/drawing/2016/5/11/chartex" xmlns:cx6="http://schemas.microsoft.com/office/drawing/2016/5/12/chartex" xmlns:cx7="http://schemas.microsoft.com/office/drawing/2016/5/13/chartex" xmlns:cx8="http://schemas.microsoft.com/office/drawing/2016/5/14/chartex" xmlns:mc="http://schemas.openxmlformats.org/markup-compatibility/2006" xmlns:aink="http://schemas.microsoft.com/office/drawing/2016/ink" xmlns:am3d="http://schemas.microsoft.com/office/drawing/2017/model3d" xmlns:o="urn:schemas-microsoft-com:office:office" xmlns:oel="http://schemas.microsoft.com/office/2019/extlst" xmlns:r="http://schemas.openxmlformats.org/officeDocument/2006/relationships" xmlns:m="http://schemas.openxmlformats.org/officeDocument/2006/math" xmlns:v="urn:schemas-microsoft-com:vml" xmlns:wp14="http://schemas.microsoft.com/office/word/2010/wordprocessingDrawing" xmlns:wp="http://schemas.openxmlformats.org/drawingml/2006/wordprocessingDrawing" xmlns:w10="urn:schemas-microsoft-com:office:word" xmlns:w="http://schemas.openxmlformats.org/wordprocessingml/2006/main" xmlns:w14="http://schemas.microsoft.com/office/word/2010/wordml" xmlns:w15="http://schemas.microsoft.com/office/word/2012/wordml" xmlns:w16cex="http://schemas.microsoft.com/office/word/2018/wordml/cex" xmlns:w16cid="http://schemas.microsoft.com/office/word/2016/wordml/cid" xmlns:w16="http://schemas.microsoft.com/office/word/2018/wordml" xmlns:w16du="http://schemas.microsoft.com/office/word/2023/wordml/word16du" xmlns:w16sdtdh="http://schemas.microsoft.com/office/word/2020/wordml/sdtdatahash" xmlns:w16sdtfl="http://schemas.microsoft.com/office/word/2024/wordml/sdtformatlock" xmlns:w16se="http://schemas.microsoft.com/office/word/2015/wordml/symex" xmlns:wpg="http://schemas.microsoft.com/office/word/2010/wordprocessingGroup" xmlns:wpi="http://schemas.microsoft.com/office/word/2010/wordprocessingInk" xmlns:wne="http://schemas.microsoft.com/office/word/2006/wordml" xmlns:wps="http://schemas.microsoft.com/office/word/2010/wordprocessingShape" mc:Ignorable="w14 w15 w16se w16cid w16 w16cex w16sdtdh w16sdtfl w16du wp14">
-  <w:comment w:id="0" w:author="Maciek Swierszcz" w:date="2026-09-01T19:19:00Z" w:initials="MS">
-    <w:p>
-      <w:pPr>
-        <w:pStyle w:val="Tekstkomentarza"/>
-      </w:pPr>
-      <w:r>
-        <w:rPr>
-          <w:rStyle w:val="Odwoaniedokomentarza"/>
-        </w:rPr>
-        <w:annotationRef/>
-      </w:r>
-      <w:r>
-        <w:t xml:space="preserve">MOJA PIECZĄTKA I PODPIS </w:t>
-      </w:r>
-    </w:p>
-  </w:comment>
-  <w:comment w:id="1" w:author="Maciek Swierszcz" w:date="2026-09-01T19:19:00Z" w:initials="MS">
-    <w:p>
-      <w:pPr>
-        <w:pStyle w:val="Tekstkomentarza"/>
-      </w:pPr>
-      <w:r>
-        <w:rPr>
-          <w:rStyle w:val="Odwoaniedokomentarza"/>
-        </w:rPr>
-        <w:annotationRef/>
-      </w:r>
-      <w:r>
-        <w:t xml:space="preserve">PODPISY I PIECZĄTKI KOMISJI EGZAMINACYJNEJ </w:t>
-      </w:r>
-    </w:p>
-  </w:comment>
-</w:comments>
-</file>
-
-<file path=word/commentsExtended.xml><?xml version="1.0" encoding="utf-8"?>
-<w15:commentsEx xmlns:wpc="http://schemas.microsoft.com/office/word/2010/wordprocessingCanvas" xmlns:cx="http://schemas.microsoft.com/office/drawing/2014/chartex" xmlns:cx1="http://schemas.microsoft.com/office/drawing/2015/9/8/chartex" xmlns:cx2="http://schemas.microsoft.com/office/drawing/2015/10/21/chartex" xmlns:cx3="http://schemas.microsoft.com/office/drawing/2016/5/9/chartex" xmlns:cx4="http://schemas.microsoft.com/office/drawing/2016/5/10/chartex" xmlns:cx5="http://schemas.microsoft.com/office/drawing/2016/5/11/chartex" xmlns:cx6="http://schemas.microsoft.com/office/drawing/2016/5/12/chartex" xmlns:cx7="http://schemas.microsoft.com/office/drawing/2016/5/13/chartex" xmlns:cx8="http://schemas.microsoft.com/office/drawing/2016/5/14/chartex" xmlns:mc="http://schemas.openxmlformats.org/markup-compatibility/2006" xmlns:aink="http://schemas.microsoft.com/office/drawing/2016/ink" xmlns:am3d="http://schemas.microsoft.com/office/drawing/2017/model3d" xmlns:o="urn:schemas-microsoft-com:office:office" xmlns:oel="http://schemas.microsoft.com/office/2019/extlst" xmlns:r="http://schemas.openxmlformats.org/officeDocument/2006/relationships" xmlns:m="http://schemas.openxmlformats.org/officeDocument/2006/math" xmlns:v="urn:schemas-microsoft-com:vml" xmlns:wp14="http://schemas.microsoft.com/office/word/2010/wordprocessingDrawing" xmlns:wp="http://schemas.openxmlformats.org/drawingml/2006/wordprocessingDrawing" xmlns:w10="urn:schemas-microsoft-com:office:word" xmlns:w="http://schemas.openxmlformats.org/wordprocessingml/2006/main" xmlns:w14="http://schemas.microsoft.com/office/word/2010/wordml" xmlns:w15="http://schemas.microsoft.com/office/word/2012/wordml" xmlns:w16cex="http://schemas.microsoft.com/office/word/2018/wordml/cex" xmlns:w16cid="http://schemas.microsoft.com/office/word/2016/wordml/cid" xmlns:w16="http://schemas.microsoft.com/office/word/2018/wordml" xmlns:w16du="http://schemas.microsoft.com/office/word/2023/wordml/word16du" xmlns:w16sdtdh="http://schemas.microsoft.com/office/word/2020/wordml/sdtdatahash" xmlns:w16sdtfl="http://schemas.microsoft.com/office/word/2024/wordml/sdtformatlock" xmlns:w16se="http://schemas.microsoft.com/office/word/2015/wordml/symex" xmlns:wpg="http://schemas.microsoft.com/office/word/2010/wordprocessingGroup" xmlns:wpi="http://schemas.microsoft.com/office/word/2010/wordprocessingInk" xmlns:wne="http://schemas.microsoft.com/office/word/2006/wordml" xmlns:wps="http://schemas.microsoft.com/office/word/2010/wordprocessingShape" mc:Ignorable="w14 w15 w16se w16cid w16 w16cex w16sdtdh w16sdtfl w16du wp14">
-  <w15:commentEx w15:paraId="531E77BF" w15:done="0"/>
-  <w15:commentEx w15:paraId="2A4A7E5E" w15:done="0"/>
-</w15:commentsEx>
-</file>
-
-<file path=word/commentsExtensible.xml><?xml version="1.0" encoding="utf-8"?>
-<w16cex:commentsExtensible xmlns:wpc="http://schemas.microsoft.com/office/word/2010/wordprocessingCanvas" xmlns:cx="http://schemas.microsoft.com/office/drawing/2014/chartex" xmlns:cx1="http://schemas.microsoft.com/office/drawing/2015/9/8/chartex" xmlns:cx2="http://schemas.microsoft.com/office/drawing/2015/10/21/chartex" xmlns:cx3="http://schemas.microsoft.com/office/drawing/2016/5/9/chartex" xmlns:cx4="http://schemas.microsoft.com/office/drawing/2016/5/10/chartex" xmlns:cx5="http://schemas.microsoft.com/office/drawing/2016/5/11/chartex" xmlns:cx6="http://schemas.microsoft.com/office/drawing/2016/5/12/chartex" xmlns:cx7="http://schemas.microsoft.com/office/drawing/2016/5/13/chartex" xmlns:cx8="http://schemas.microsoft.com/office/drawing/2016/5/14/chartex" xmlns:cr="http://schemas.microsoft.com/office/comments/2020/reactions" xmlns:mc="http://schemas.openxmlformats.org/markup-compatibility/2006" xmlns:aink="http://schemas.microsoft.com/office/drawing/2016/ink" xmlns:am3d="http://schemas.microsoft.com/office/drawing/2017/model3d" xmlns:o="urn:schemas-microsoft-com:office:office" xmlns:oel="http://schemas.microsoft.com/office/2019/extlst" xmlns:r="http://schemas.openxmlformats.org/officeDocument/2006/relationships" xmlns:m="http://schemas.openxmlformats.org/officeDocument/2006/math" xmlns:v="urn:schemas-microsoft-com:vml" xmlns:wp14="http://schemas.microsoft.com/office/word/2010/wordprocessingDrawing" xmlns:wp="http://schemas.openxmlformats.org/drawingml/2006/wordprocessingDrawing" xmlns:w10="urn:schemas-microsoft-com:office:word" xmlns:w="http://schemas.openxmlformats.org/wordprocessingml/2006/main" xmlns:w14="http://schemas.microsoft.com/office/word/2010/wordml" xmlns:w15="http://schemas.microsoft.com/office/word/2012/wordml" xmlns:w16cex="http://schemas.microsoft.com/office/word/2018/wordml/cex" xmlns:w16cid="http://schemas.microsoft.com/office/word/2016/wordml/cid" xmlns:w16="http://schemas.microsoft.com/office/word/2018/wordml" xmlns:w16du="http://schemas.microsoft.com/office/word/2023/wordml/word16du" xmlns:w16sdtdh="http://schemas.microsoft.com/office/word/2020/wordml/sdtdatahash" xmlns:w16sdtfl="http://schemas.microsoft.com/office/word/2024/wordml/sdtformatlock" xmlns:w16se="http://schemas.microsoft.com/office/word/2015/wordml/symex" xmlns:wpg="http://schemas.microsoft.com/office/word/2010/wordprocessingGroup" xmlns:wpi="http://schemas.microsoft.com/office/word/2010/wordprocessingInk" xmlns:wne="http://schemas.microsoft.com/office/word/2006/wordml" xmlns:wps="http://schemas.microsoft.com/office/word/2010/wordprocessingShape" mc:Ignorable="w14 w15 w16se w16cid w16 w16cex w16sdtdh w16sdtfl cr w16du wp14">
-  <w16cex:commentExtensible w16cex:durableId="1C6CCE61" w16cex:dateUtc="2026-09-01T17:19:00Z"/>
-  <w16cex:commentExtensible w16cex:durableId="42E8568D" w16cex:dateUtc="2026-09-01T17:19:00Z"/>
-</w16cex:commentsExtensible>
-</file>
-
-<file path=word/commentsIds.xml><?xml version="1.0" encoding="utf-8"?>
-<w16cid:commentsIds xmlns:wpc="http://schemas.microsoft.com/office/word/2010/wordprocessingCanvas" xmlns:cx="http://schemas.microsoft.com/office/drawing/2014/chartex" xmlns:cx1="http://schemas.microsoft.com/office/drawing/2015/9/8/chartex" xmlns:cx2="http://schemas.microsoft.com/office/drawing/2015/10/21/chartex" xmlns:cx3="http://schemas.microsoft.com/office/drawing/2016/5/9/chartex" xmlns:cx4="http://schemas.microsoft.com/office/drawing/2016/5/10/chartex" xmlns:cx5="http://schemas.microsoft.com/office/drawing/2016/5/11/chartex" xmlns:cx6="http://schemas.microsoft.com/office/drawing/2016/5/12/chartex" xmlns:cx7="http://schemas.microsoft.com/office/drawing/2016/5/13/chartex" xmlns:cx8="http://schemas.microsoft.com/office/drawing/2016/5/14/chartex" xmlns:mc="http://schemas.openxmlformats.org/markup-compatibility/2006" xmlns:aink="http://schemas.microsoft.com/office/drawing/2016/ink" xmlns:am3d="http://schemas.microsoft.com/office/drawing/2017/model3d" xmlns:o="urn:schemas-microsoft-com:office:office" xmlns:oel="http://schemas.microsoft.com/office/2019/extlst" xmlns:r="http://schemas.openxmlformats.org/officeDocument/2006/relationships" xmlns:m="http://schemas.openxmlformats.org/officeDocument/2006/math" xmlns:v="urn:schemas-microsoft-com:vml" xmlns:wp14="http://schemas.microsoft.com/office/word/2010/wordprocessingDrawing" xmlns:wp="http://schemas.openxmlformats.org/drawingml/2006/wordprocessingDrawing" xmlns:w10="urn:schemas-microsoft-com:office:word" xmlns:w="http://schemas.openxmlformats.org/wordprocessingml/2006/main" xmlns:w14="http://schemas.microsoft.com/office/word/2010/wordml" xmlns:w15="http://schemas.microsoft.com/office/word/2012/wordml" xmlns:w16cex="http://schemas.microsoft.com/office/word/2018/wordml/cex" xmlns:w16cid="http://schemas.microsoft.com/office/word/2016/wordml/cid" xmlns:w16="http://schemas.microsoft.com/office/word/2018/wordml" xmlns:w16du="http://schemas.microsoft.com/office/word/2023/wordml/word16du" xmlns:w16sdtdh="http://schemas.microsoft.com/office/word/2020/wordml/sdtdatahash" xmlns:w16sdtfl="http://schemas.microsoft.com/office/word/2024/wordml/sdtformatlock" xmlns:w16se="http://schemas.microsoft.com/office/word/2015/wordml/symex" xmlns:wpg="http://schemas.microsoft.com/office/word/2010/wordprocessingGroup" xmlns:wpi="http://schemas.microsoft.com/office/word/2010/wordprocessingInk" xmlns:wne="http://schemas.microsoft.com/office/word/2006/wordml" xmlns:wps="http://schemas.microsoft.com/office/word/2010/wordprocessingShape" mc:Ignorable="w14 w15 w16se w16cid w16 w16cex w16sdtdh w16sdtfl w16du wp14">
-  <w16cid:commentId w16cid:paraId="531E77BF" w16cid:durableId="1C6CCE61"/>
-  <w16cid:commentId w16cid:paraId="2A4A7E5E" w16cid:durableId="42E8568D"/>
-</w16cid:commentsIds>
-</file>
-
-<file path=word/people.xml><?xml version="1.0" encoding="utf-8"?>
-<w15:people xmlns:wpc="http://schemas.microsoft.com/office/word/2010/wordprocessingCanvas" xmlns:cx="http://schemas.microsoft.com/office/drawing/2014/chartex" xmlns:cx1="http://schemas.microsoft.com/office/drawing/2015/9/8/chartex" xmlns:cx2="http://schemas.microsoft.com/office/drawing/2015/10/21/chartex" xmlns:cx3="http://schemas.microsoft.com/office/drawing/2016/5/9/chartex" xmlns:cx4="http://schemas.microsoft.com/office/drawing/2016/5/10/chartex" xmlns:cx5="http://schemas.microsoft.com/office/drawing/2016/5/11/chartex" xmlns:cx6="http://schemas.microsoft.com/office/drawing/2016/5/12/chartex" xmlns:cx7="http://schemas.microsoft.com/office/drawing/2016/5/13/chartex" xmlns:cx8="http://schemas.microsoft.com/office/drawing/2016/5/14/chartex" xmlns:mc="http://schemas.openxmlformats.org/markup-compatibility/2006" xmlns:aink="http://schemas.microsoft.com/office/drawing/2016/ink" xmlns:am3d="http://schemas.microsoft.com/office/drawing/2017/model3d" xmlns:o="urn:schemas-microsoft-com:office:office" xmlns:oel="http://schemas.microsoft.com/office/2019/extlst" xmlns:r="http://schemas.openxmlformats.org/officeDocument/2006/relationships" xmlns:m="http://schemas.openxmlformats.org/officeDocument/2006/math" xmlns:v="urn:schemas-microsoft-com:vml" xmlns:wp14="http://schemas.microsoft.com/office/word/2010/wordprocessingDrawing" xmlns:wp="http://schemas.openxmlformats.org/drawingml/2006/wordprocessingDrawing" xmlns:w10="urn:schemas-microsoft-com:office:word" xmlns:w="http://schemas.openxmlformats.org/wordprocessingml/2006/main" xmlns:w14="http://schemas.microsoft.com/office/word/2010/wordml" xmlns:w15="http://schemas.microsoft.com/office/word/2012/wordml" xmlns:w16cex="http://schemas.microsoft.com/office/word/2018/wordml/cex" xmlns:w16cid="http://schemas.microsoft.com/office/word/2016/wordml/cid" xmlns:w16="http://schemas.microsoft.com/office/word/2018/wordml" xmlns:w16du="http://schemas.microsoft.com/office/word/2023/wordml/word16du" xmlns:w16sdtdh="http://schemas.microsoft.com/office/word/2020/wordml/sdtdatahash" xmlns:w16sdtfl="http://schemas.microsoft.com/office/word/2024/wordml/sdtformatlock" xmlns:w16se="http://schemas.microsoft.com/office/word/2015/wordml/symex" xmlns:wpg="http://schemas.microsoft.com/office/word/2010/wordprocessingGroup" xmlns:wpi="http://schemas.microsoft.com/office/word/2010/wordprocessingInk" xmlns:wne="http://schemas.microsoft.com/office/word/2006/wordml" xmlns:wps="http://schemas.microsoft.com/office/word/2010/wordprocessingShape" mc:Ignorable="w14 w15 w16se w16cid w16 w16cex w16sdtdh w16sdtfl w16du wp14">
-  <w15:person w15:author="Maciek Swierszcz">
-    <w15:presenceInfo w15:providerId="Windows Live" w15:userId="de51706e1ac80d7d"/>
-  </w15:person>
-</w15:people>
-</file>
-
 <file path=word/styles.xml><?xml version="1.0" encoding="utf-8"?>
-<w:styles xmlns:mc="http://schemas.openxmlformats.org/markup-compatibility/2006" xmlns:r="http://schemas.openxmlformats.org/officeDocument/2006/relationships" xmlns:w="http://schemas.openxmlformats.org/wordprocessingml/2006/main" xmlns:w14="http://schemas.microsoft.com/office/word/2010/wordml" xmlns:w15="http://schemas.microsoft.com/office/word/2012/wordml" xmlns:w16cex="http://schemas.microsoft.com/office/word/2018/wordml/cex" xmlns:w16cid="http://schemas.microsoft.com/office/word/2016/wordml/cid" xmlns:w16="http://schemas.microsoft.com/office/word/2018/wordml" xmlns:w16du="http://schemas.microsoft.com/office/word/2023/wordml/word16du" xmlns:w16sdtdh="http://schemas.microsoft.com/office/word/2020/wordml/sdtdatahash" xmlns:w16sdtfl="http://schemas.microsoft.com/office/word/2024/wordml/sdtformatlock" xmlns:w16se="http://schemas.microsoft.com/office/word/2015/wordml/symex" mc:Ignorable="w14 w15 w16se w16cid w16 w16cex w16sdtdh w16sdtfl w16du">
+<w:styles xmlns:mc="http://schemas.openxmlformats.org/markup-compatibility/2006" xmlns:r="http://schemas.openxmlformats.org/officeDocument/2006/relationships" xmlns:w="http://schemas.openxmlformats.org/wordprocessingml/2006/main" xmlns:w14="http://schemas.microsoft.com/office/word/2010/wordml" xmlns:w15="http://schemas.microsoft.com/office/word/2012/wordml" xmlns:w16cex="http://schemas.microsoft.com/office/word/2018/wordml/cex" xmlns:w16cid="http://schemas.microsoft.com/office/word/2016/wordml/cid" xmlns:w16="http://schemas.microsoft.com/office/word/2018/wordml" xmlns:w16sdtdh="http://schemas.microsoft.com/office/word/2020/wordml/sdtdatahash" xmlns:w16sdtfl="http://schemas.microsoft.com/office/word/2024/wordml/sdtformatlock" xmlns:w16se="http://schemas.microsoft.com/office/word/2015/wordml/symex" xmlns:w16du="http://schemas.microsoft.com/office/word/2023/wordml/word16du" mc:Ignorable="w14 w15 w16se w16cid w16 w16cex w16sdtdh w16sdtfl w16du">
   <w:docDefaults>
     <w:rPrDefault>
       <w:rPr>

</xml_diff>